<commit_message>
chore(ui): improve UI - orders table and menu bar
</commit_message>
<xml_diff>
--- a/templates/acceptance_template.docx
+++ b/templates/acceptance_template.docx
@@ -8,7 +8,6 @@
         <w:jc w:val="center"/>
         <w:rPr>
           <w:rFonts w:ascii="Times New Roman" w:hAnsi="Times New Roman" w:cs="Times New Roman"/>
-          <w:lang w:val="ru-RU"/>
         </w:rPr>
       </w:pPr>
       <w:r>
@@ -17,7 +16,6 @@
           <w:b/>
           <w:color w:val="333333"/>
           <w:sz w:val="28"/>
-          <w:lang w:val="ru-RU"/>
         </w:rPr>
         <w:t>Акт приема-сдачи выполненных работ</w:t>
       </w:r>
@@ -37,123 +35,26 @@
         </w:rPr>
         <w:t xml:space="preserve">№ </w:t>
       </w:r>
-      <w:proofErr w:type="gramStart"/>
       <w:r>
         <w:rPr>
           <w:rFonts w:ascii="Times New Roman" w:hAnsi="Times New Roman" w:cs="Times New Roman"/>
           <w:b/>
         </w:rPr>
-        <w:t xml:space="preserve">{{ </w:t>
-      </w:r>
-      <w:proofErr w:type="spellStart"/>
-      <w:r>
-        <w:rPr>
-          <w:rFonts w:ascii="Times New Roman" w:hAnsi="Times New Roman" w:cs="Times New Roman"/>
-          <w:b/>
-        </w:rPr>
-        <w:t>document</w:t>
-      </w:r>
-      <w:proofErr w:type="gramEnd"/>
-      <w:r>
-        <w:rPr>
-          <w:rFonts w:ascii="Times New Roman" w:hAnsi="Times New Roman" w:cs="Times New Roman"/>
-          <w:b/>
-        </w:rPr>
-        <w:t>_</w:t>
-      </w:r>
-      <w:proofErr w:type="gramStart"/>
-      <w:r>
-        <w:rPr>
-          <w:rFonts w:ascii="Times New Roman" w:hAnsi="Times New Roman" w:cs="Times New Roman"/>
-          <w:b/>
-        </w:rPr>
-        <w:t>number</w:t>
-      </w:r>
-      <w:proofErr w:type="spellEnd"/>
-      <w:r>
-        <w:rPr>
-          <w:rFonts w:ascii="Times New Roman" w:hAnsi="Times New Roman" w:cs="Times New Roman"/>
-          <w:b/>
-        </w:rPr>
-        <w:t xml:space="preserve"> }</w:t>
-      </w:r>
-      <w:proofErr w:type="gramEnd"/>
-      <w:r>
-        <w:rPr>
-          <w:rFonts w:ascii="Times New Roman" w:hAnsi="Times New Roman" w:cs="Times New Roman"/>
-          <w:b/>
-        </w:rPr>
-        <w:t>}</w:t>
+        <w:t>{{ document_number }}</w:t>
       </w:r>
       <w:r>
         <w:rPr>
           <w:rFonts w:ascii="Times New Roman" w:hAnsi="Times New Roman" w:cs="Times New Roman"/>
           <w:b/>
         </w:rPr>
-        <w:t xml:space="preserve"> </w:t>
-      </w:r>
-      <w:r>
-        <w:rPr>
-          <w:rFonts w:ascii="Times New Roman" w:hAnsi="Times New Roman" w:cs="Times New Roman"/>
-          <w:b/>
-          <w:lang w:val="ru-RU"/>
-        </w:rPr>
-        <w:t>от</w:t>
+        <w:t xml:space="preserve"> от </w:t>
       </w:r>
       <w:r>
         <w:rPr>
           <w:rFonts w:ascii="Times New Roman" w:hAnsi="Times New Roman" w:cs="Times New Roman"/>
           <w:b/>
         </w:rPr>
-        <w:t xml:space="preserve"> </w:t>
-      </w:r>
-      <w:proofErr w:type="gramStart"/>
-      <w:r>
-        <w:rPr>
-          <w:rFonts w:ascii="Times New Roman" w:hAnsi="Times New Roman" w:cs="Times New Roman"/>
-          <w:b/>
-        </w:rPr>
-        <w:t xml:space="preserve">{{ </w:t>
-      </w:r>
-      <w:proofErr w:type="spellStart"/>
-      <w:r>
-        <w:rPr>
-          <w:rFonts w:ascii="Times New Roman" w:hAnsi="Times New Roman" w:cs="Times New Roman"/>
-          <w:b/>
-        </w:rPr>
-        <w:t>document</w:t>
-      </w:r>
-      <w:proofErr w:type="gramEnd"/>
-      <w:r>
-        <w:rPr>
-          <w:rFonts w:ascii="Times New Roman" w:hAnsi="Times New Roman" w:cs="Times New Roman"/>
-          <w:b/>
-        </w:rPr>
-        <w:t>_</w:t>
-      </w:r>
-      <w:proofErr w:type="gramStart"/>
-      <w:r>
-        <w:rPr>
-          <w:rFonts w:ascii="Times New Roman" w:hAnsi="Times New Roman" w:cs="Times New Roman"/>
-          <w:b/>
-        </w:rPr>
-        <w:t>date</w:t>
-      </w:r>
-      <w:proofErr w:type="spellEnd"/>
-      <w:r>
-        <w:rPr>
-          <w:rFonts w:ascii="Times New Roman" w:hAnsi="Times New Roman" w:cs="Times New Roman"/>
-          <w:b/>
-        </w:rPr>
-        <w:t xml:space="preserve"> }</w:t>
-      </w:r>
-      <w:proofErr w:type="gramEnd"/>
-      <w:r>
-        <w:rPr>
-          <w:rFonts w:ascii="Times New Roman" w:hAnsi="Times New Roman" w:cs="Times New Roman"/>
-          <w:b/>
-        </w:rPr>
-        <w:t>}</w:t>
+        <w:t>{{ document_date }}</w:t>
       </w:r>
     </w:p>
     <w:p>
@@ -167,72 +68,14 @@
         <w:rPr>
           <w:rFonts w:ascii="Times New Roman" w:hAnsi="Times New Roman" w:cs="Times New Roman"/>
           <w:b/>
-          <w:lang w:val="ru-RU"/>
         </w:rPr>
-        <w:t>Заказчик</w:t>
+        <w:t xml:space="preserve">Заказчик: </w:t>
       </w:r>
       <w:r>
         <w:rPr>
           <w:rFonts w:ascii="Times New Roman" w:hAnsi="Times New Roman" w:cs="Times New Roman"/>
-          <w:b/>
         </w:rPr>
-        <w:t xml:space="preserve">: </w:t>
-      </w:r>
-      <w:proofErr w:type="gramStart"/>
-      <w:r>
-        <w:rPr>
-          <w:rFonts w:ascii="Times New Roman" w:hAnsi="Times New Roman" w:cs="Times New Roman"/>
-        </w:rPr>
-        <w:t>{{ client.name</w:t>
-      </w:r>
-      <w:proofErr w:type="gramEnd"/>
-      <w:r>
-        <w:rPr>
-          <w:rFonts w:ascii="Times New Roman" w:hAnsi="Times New Roman" w:cs="Times New Roman"/>
-        </w:rPr>
-        <w:t xml:space="preserve"> }}, </w:t>
-      </w:r>
-      <w:proofErr w:type="gramStart"/>
-      <w:r>
-        <w:rPr>
-          <w:rFonts w:ascii="Times New Roman" w:hAnsi="Times New Roman" w:cs="Times New Roman"/>
-        </w:rPr>
-        <w:t xml:space="preserve">{{ </w:t>
-      </w:r>
-      <w:proofErr w:type="spellStart"/>
-      <w:r>
-        <w:rPr>
-          <w:rFonts w:ascii="Times New Roman" w:hAnsi="Times New Roman" w:cs="Times New Roman"/>
-        </w:rPr>
-        <w:t>client</w:t>
-      </w:r>
-      <w:proofErr w:type="gramEnd"/>
-      <w:r>
-        <w:rPr>
-          <w:rFonts w:ascii="Times New Roman" w:hAnsi="Times New Roman" w:cs="Times New Roman"/>
-        </w:rPr>
-        <w:t>.</w:t>
-      </w:r>
-      <w:proofErr w:type="gramStart"/>
-      <w:r>
-        <w:rPr>
-          <w:rFonts w:ascii="Times New Roman" w:hAnsi="Times New Roman" w:cs="Times New Roman"/>
-        </w:rPr>
-        <w:t>address</w:t>
-      </w:r>
-      <w:proofErr w:type="spellEnd"/>
-      <w:r>
-        <w:rPr>
-          <w:rFonts w:ascii="Times New Roman" w:hAnsi="Times New Roman" w:cs="Times New Roman"/>
-        </w:rPr>
-        <w:t xml:space="preserve"> }</w:t>
-      </w:r>
-      <w:proofErr w:type="gramEnd"/>
-      <w:r>
-        <w:rPr>
-          <w:rFonts w:ascii="Times New Roman" w:hAnsi="Times New Roman" w:cs="Times New Roman"/>
-        </w:rPr>
-        <w:t>}</w:t>
+        <w:t>{{ client.name }}, {{ client.address }}</w:t>
       </w:r>
     </w:p>
     <w:p>
@@ -246,201 +89,64 @@
         <w:rPr>
           <w:rFonts w:ascii="Times New Roman" w:hAnsi="Times New Roman" w:cs="Times New Roman"/>
           <w:b/>
-          <w:lang w:val="ru-RU"/>
         </w:rPr>
-        <w:t>Исполнитель</w:t>
-      </w:r>
-      <w:r>
-        <w:rPr>
-          <w:rFonts w:ascii="Times New Roman" w:hAnsi="Times New Roman" w:cs="Times New Roman"/>
-          <w:b/>
-        </w:rPr>
-        <w:t xml:space="preserve">: </w:t>
-      </w:r>
-      <w:proofErr w:type="gramStart"/>
-      <w:r>
-        <w:rPr>
-          <w:rFonts w:ascii="Times New Roman" w:hAnsi="Times New Roman" w:cs="Times New Roman"/>
-        </w:rPr>
-        <w:t>{{ company.name</w:t>
-      </w:r>
-      <w:proofErr w:type="gramEnd"/>
-      <w:r>
-        <w:rPr>
-          <w:rFonts w:ascii="Times New Roman" w:hAnsi="Times New Roman" w:cs="Times New Roman"/>
-        </w:rPr>
-        <w:t xml:space="preserve"> }}</w:t>
+        <w:t xml:space="preserve">Исполнитель: </w:t>
       </w:r>
       <w:r>
         <w:rPr>
           <w:rFonts w:ascii="Times New Roman" w:hAnsi="Times New Roman" w:cs="Times New Roman"/>
         </w:rPr>
-        <w:t xml:space="preserve">, </w:t>
-      </w:r>
-      <w:proofErr w:type="gramStart"/>
-      <w:r>
-        <w:rPr>
-          <w:rFonts w:ascii="Times New Roman" w:hAnsi="Times New Roman" w:cs="Times New Roman"/>
-        </w:rPr>
-        <w:t xml:space="preserve">{{ </w:t>
-      </w:r>
-      <w:proofErr w:type="spellStart"/>
-      <w:r>
-        <w:rPr>
-          <w:rFonts w:ascii="Times New Roman" w:hAnsi="Times New Roman" w:cs="Times New Roman"/>
-        </w:rPr>
-        <w:t>company</w:t>
-      </w:r>
-      <w:proofErr w:type="gramEnd"/>
-      <w:r>
-        <w:rPr>
-          <w:rFonts w:ascii="Times New Roman" w:hAnsi="Times New Roman" w:cs="Times New Roman"/>
-        </w:rPr>
-        <w:t>.</w:t>
-      </w:r>
-      <w:proofErr w:type="gramStart"/>
-      <w:r>
-        <w:rPr>
-          <w:rFonts w:ascii="Times New Roman" w:hAnsi="Times New Roman" w:cs="Times New Roman"/>
-        </w:rPr>
-        <w:t>address</w:t>
-      </w:r>
-      <w:proofErr w:type="spellEnd"/>
-      <w:r>
-        <w:rPr>
-          <w:rFonts w:ascii="Times New Roman" w:hAnsi="Times New Roman" w:cs="Times New Roman"/>
-        </w:rPr>
-        <w:t xml:space="preserve"> }</w:t>
-      </w:r>
-      <w:proofErr w:type="gramEnd"/>
-      <w:r>
-        <w:rPr>
-          <w:rFonts w:ascii="Times New Roman" w:hAnsi="Times New Roman" w:cs="Times New Roman"/>
-        </w:rPr>
-        <w:t>}</w:t>
+        <w:t>{{ company.name }}, {{ company.address }}</w:t>
       </w:r>
     </w:p>
     <w:tbl>
       <w:tblPr>
-        <w:tblStyle w:val="aff0"/>
-        <w:tblW w:w="0" w:type="auto"/>
+        <w:tblW w:w="10256" w:type="dxa"/>
+        <w:jc w:val="center"/>
+        <w:tblBorders>
+          <w:top w:val="single" w:sz="12" w:space="0" w:color="000000"/>
+          <w:left w:val="single" w:sz="12" w:space="0" w:color="000000"/>
+          <w:bottom w:val="single" w:sz="12" w:space="0" w:color="000000"/>
+          <w:right w:val="single" w:sz="12" w:space="0" w:color="000000"/>
+          <w:insideH w:val="single" w:sz="6" w:space="0" w:color="000000"/>
+          <w:insideV w:val="single" w:sz="6" w:space="0" w:color="000000"/>
+        </w:tblBorders>
+        <w:tblLayout w:type="fixed"/>
+        <w:tblCellMar>
+          <w:top w:w="50" w:type="dxa"/>
+          <w:left w:w="50" w:type="dxa"/>
+          <w:bottom w:w="50" w:type="dxa"/>
+          <w:right w:w="50" w:type="dxa"/>
+        </w:tblCellMar>
         <w:tblLook w:val="04A0" w:firstRow="1" w:lastRow="0" w:firstColumn="1" w:lastColumn="0" w:noHBand="0" w:noVBand="1"/>
       </w:tblPr>
       <w:tblGrid>
-        <w:gridCol w:w="711"/>
-        <w:gridCol w:w="3508"/>
-        <w:gridCol w:w="1144"/>
-        <w:gridCol w:w="1224"/>
-        <w:gridCol w:w="1425"/>
-        <w:gridCol w:w="1564"/>
+        <w:gridCol w:w="1184"/>
+        <w:gridCol w:w="4678"/>
+        <w:gridCol w:w="992"/>
+        <w:gridCol w:w="709"/>
+        <w:gridCol w:w="1134"/>
+        <w:gridCol w:w="1559"/>
       </w:tblGrid>
       <w:tr>
+        <w:trPr>
+          <w:trHeight w:val="400"/>
+          <w:jc w:val="center"/>
+        </w:trPr>
         <w:tc>
           <w:tcPr>
-            <w:tcW w:w="711" w:type="dxa"/>
+            <w:tcW w:w="1184" w:type="dxa"/>
+            <w:tcBorders>
+              <w:top w:val="single" w:sz="4" w:space="0" w:color="auto"/>
+              <w:left w:val="single" w:sz="4" w:space="0" w:color="auto"/>
+              <w:bottom w:val="single" w:sz="4" w:space="0" w:color="auto"/>
+              <w:right w:val="single" w:sz="4" w:space="0" w:color="auto"/>
+            </w:tcBorders>
+            <w:vAlign w:val="center"/>
           </w:tcPr>
           <w:p>
             <w:pPr>
-              <w:jc w:val="center"/>
-              <w:rPr>
-                <w:rFonts w:ascii="Times New Roman" w:hAnsi="Times New Roman" w:cs="Times New Roman"/>
-                <w:b/>
-                <w:bCs/>
-                <w:lang w:val="ru-RU"/>
-              </w:rPr>
-            </w:pPr>
-            <w:r>
-              <w:rPr>
-                <w:rFonts w:ascii="Times New Roman" w:hAnsi="Times New Roman" w:cs="Times New Roman"/>
-                <w:b/>
-                <w:bCs/>
-                <w:lang w:val="ru-RU"/>
-              </w:rPr>
-              <w:t>№</w:t>
-            </w:r>
-          </w:p>
-        </w:tc>
-        <w:tc>
-          <w:tcPr>
-            <w:tcW w:w="3508" w:type="dxa"/>
-          </w:tcPr>
-          <w:p>
-            <w:pPr>
-              <w:jc w:val="center"/>
-              <w:rPr>
-                <w:rFonts w:ascii="Times New Roman" w:hAnsi="Times New Roman" w:cs="Times New Roman"/>
-                <w:b/>
-                <w:bCs/>
-                <w:sz w:val="20"/>
-                <w:szCs w:val="20"/>
-                <w:lang w:val="ru-RU"/>
-              </w:rPr>
-            </w:pPr>
-            <w:r>
-              <w:rPr>
-                <w:rFonts w:ascii="Times New Roman" w:hAnsi="Times New Roman" w:cs="Times New Roman"/>
-                <w:b/>
-                <w:bCs/>
-                <w:lang w:val="ru-RU"/>
-              </w:rPr>
-              <w:t>Услуга</w:t>
-            </w:r>
-          </w:p>
-        </w:tc>
-        <w:tc>
-          <w:tcPr>
-            <w:tcW w:w="1144" w:type="dxa"/>
-          </w:tcPr>
-          <w:p>
-            <w:pPr>
-              <w:jc w:val="center"/>
-              <w:rPr>
-                <w:rFonts w:ascii="Times New Roman" w:hAnsi="Times New Roman" w:cs="Times New Roman"/>
-                <w:b/>
-                <w:bCs/>
-                <w:lang w:val="ru-RU"/>
-              </w:rPr>
-            </w:pPr>
-            <w:r>
-              <w:rPr>
-                <w:rFonts w:ascii="Times New Roman" w:hAnsi="Times New Roman" w:cs="Times New Roman"/>
-                <w:b/>
-                <w:bCs/>
-                <w:lang w:val="ru-RU"/>
-              </w:rPr>
-              <w:t>Ед. изм</w:t>
-            </w:r>
-          </w:p>
-        </w:tc>
-        <w:tc>
-          <w:tcPr>
-            <w:tcW w:w="1224" w:type="dxa"/>
-          </w:tcPr>
-          <w:p>
-            <w:pPr>
-              <w:jc w:val="center"/>
-              <w:rPr>
-                <w:rFonts w:ascii="Times New Roman" w:hAnsi="Times New Roman" w:cs="Times New Roman"/>
-              </w:rPr>
-            </w:pPr>
-            <w:proofErr w:type="spellStart"/>
-            <w:r>
-              <w:rPr>
-                <w:rFonts w:ascii="Times New Roman" w:hAnsi="Times New Roman" w:cs="Times New Roman"/>
-                <w:b/>
-                <w:sz w:val="20"/>
-              </w:rPr>
-              <w:t>Кол-во</w:t>
-            </w:r>
-            <w:proofErr w:type="spellEnd"/>
-          </w:p>
-        </w:tc>
-        <w:tc>
-          <w:tcPr>
-            <w:tcW w:w="1425" w:type="dxa"/>
-          </w:tcPr>
-          <w:p>
-            <w:pPr>
+              <w:spacing w:after="0" w:line="240" w:lineRule="auto"/>
               <w:jc w:val="center"/>
               <w:rPr>
                 <w:rFonts w:ascii="Times New Roman" w:hAnsi="Times New Roman" w:cs="Times New Roman"/>
@@ -450,18 +156,26 @@
               <w:rPr>
                 <w:rFonts w:ascii="Times New Roman" w:hAnsi="Times New Roman" w:cs="Times New Roman"/>
                 <w:b/>
-                <w:sz w:val="20"/>
+                <w:bCs/>
               </w:rPr>
-              <w:t>Цена</w:t>
+              <w:t>№</w:t>
             </w:r>
           </w:p>
         </w:tc>
         <w:tc>
           <w:tcPr>
-            <w:tcW w:w="1564" w:type="dxa"/>
+            <w:tcW w:w="4678" w:type="dxa"/>
+            <w:tcBorders>
+              <w:top w:val="single" w:sz="4" w:space="0" w:color="auto"/>
+              <w:left w:val="single" w:sz="4" w:space="0" w:color="auto"/>
+              <w:bottom w:val="single" w:sz="4" w:space="0" w:color="auto"/>
+              <w:right w:val="single" w:sz="4" w:space="0" w:color="auto"/>
+            </w:tcBorders>
+            <w:vAlign w:val="center"/>
           </w:tcPr>
           <w:p>
             <w:pPr>
+              <w:spacing w:after="0" w:line="240" w:lineRule="auto"/>
               <w:jc w:val="center"/>
               <w:rPr>
                 <w:rFonts w:ascii="Times New Roman" w:hAnsi="Times New Roman" w:cs="Times New Roman"/>
@@ -471,7 +185,123 @@
               <w:rPr>
                 <w:rFonts w:ascii="Times New Roman" w:hAnsi="Times New Roman" w:cs="Times New Roman"/>
                 <w:b/>
-                <w:sz w:val="20"/>
+                <w:bCs/>
+              </w:rPr>
+              <w:t>Наименование работ, услуг</w:t>
+            </w:r>
+          </w:p>
+        </w:tc>
+        <w:tc>
+          <w:tcPr>
+            <w:tcW w:w="992" w:type="dxa"/>
+            <w:tcBorders>
+              <w:top w:val="single" w:sz="4" w:space="0" w:color="auto"/>
+              <w:left w:val="single" w:sz="4" w:space="0" w:color="auto"/>
+              <w:bottom w:val="single" w:sz="4" w:space="0" w:color="auto"/>
+              <w:right w:val="single" w:sz="4" w:space="0" w:color="auto"/>
+            </w:tcBorders>
+            <w:vAlign w:val="center"/>
+          </w:tcPr>
+          <w:p>
+            <w:pPr>
+              <w:spacing w:after="0" w:line="240" w:lineRule="auto"/>
+              <w:jc w:val="center"/>
+              <w:rPr>
+                <w:rFonts w:ascii="Times New Roman" w:hAnsi="Times New Roman" w:cs="Times New Roman"/>
+              </w:rPr>
+            </w:pPr>
+            <w:r>
+              <w:rPr>
+                <w:rFonts w:ascii="Times New Roman" w:hAnsi="Times New Roman" w:cs="Times New Roman"/>
+                <w:b/>
+                <w:bCs/>
+              </w:rPr>
+              <w:t>Кол-вo</w:t>
+            </w:r>
+          </w:p>
+        </w:tc>
+        <w:tc>
+          <w:tcPr>
+            <w:tcW w:w="709" w:type="dxa"/>
+            <w:tcBorders>
+              <w:top w:val="single" w:sz="4" w:space="0" w:color="auto"/>
+              <w:left w:val="single" w:sz="4" w:space="0" w:color="auto"/>
+              <w:bottom w:val="single" w:sz="4" w:space="0" w:color="auto"/>
+              <w:right w:val="single" w:sz="4" w:space="0" w:color="auto"/>
+            </w:tcBorders>
+            <w:vAlign w:val="center"/>
+          </w:tcPr>
+          <w:p>
+            <w:pPr>
+              <w:spacing w:after="0" w:line="240" w:lineRule="auto"/>
+              <w:jc w:val="center"/>
+              <w:rPr>
+                <w:rFonts w:ascii="Times New Roman" w:hAnsi="Times New Roman" w:cs="Times New Roman"/>
+              </w:rPr>
+            </w:pPr>
+            <w:r>
+              <w:rPr>
+                <w:rFonts w:ascii="Times New Roman" w:hAnsi="Times New Roman" w:cs="Times New Roman"/>
+                <w:b/>
+                <w:bCs/>
+              </w:rPr>
+              <w:t>Ед.</w:t>
+            </w:r>
+          </w:p>
+        </w:tc>
+        <w:tc>
+          <w:tcPr>
+            <w:tcW w:w="1134" w:type="dxa"/>
+            <w:tcBorders>
+              <w:top w:val="single" w:sz="4" w:space="0" w:color="auto"/>
+              <w:left w:val="single" w:sz="4" w:space="0" w:color="auto"/>
+              <w:bottom w:val="single" w:sz="4" w:space="0" w:color="auto"/>
+              <w:right w:val="single" w:sz="4" w:space="0" w:color="auto"/>
+            </w:tcBorders>
+            <w:vAlign w:val="center"/>
+          </w:tcPr>
+          <w:p>
+            <w:pPr>
+              <w:spacing w:after="0" w:line="240" w:lineRule="auto"/>
+              <w:jc w:val="center"/>
+              <w:rPr>
+                <w:rFonts w:ascii="Times New Roman" w:hAnsi="Times New Roman" w:cs="Times New Roman"/>
+              </w:rPr>
+            </w:pPr>
+            <w:r>
+              <w:rPr>
+                <w:rFonts w:ascii="Times New Roman" w:hAnsi="Times New Roman" w:cs="Times New Roman"/>
+                <w:b/>
+                <w:bCs/>
+              </w:rPr>
+              <w:t>Цена</w:t>
+            </w:r>
+          </w:p>
+        </w:tc>
+        <w:tc>
+          <w:tcPr>
+            <w:tcW w:w="1559" w:type="dxa"/>
+            <w:tcBorders>
+              <w:top w:val="single" w:sz="4" w:space="0" w:color="auto"/>
+              <w:left w:val="single" w:sz="4" w:space="0" w:color="auto"/>
+              <w:bottom w:val="single" w:sz="4" w:space="0" w:color="auto"/>
+              <w:right w:val="single" w:sz="4" w:space="0" w:color="auto"/>
+            </w:tcBorders>
+            <w:vAlign w:val="center"/>
+          </w:tcPr>
+          <w:p>
+            <w:pPr>
+              <w:spacing w:after="0" w:line="240" w:lineRule="auto"/>
+              <w:jc w:val="center"/>
+              <w:rPr>
+                <w:rFonts w:ascii="Times New Roman" w:hAnsi="Times New Roman" w:cs="Times New Roman"/>
+              </w:rPr>
+            </w:pPr>
+            <w:r>
+              <w:rPr>
+                <w:rFonts w:ascii="Times New Roman" w:hAnsi="Times New Roman" w:cs="Times New Roman"/>
+                <w:b/>
+                <w:bCs/>
               </w:rPr>
               <w:t>Сумма</w:t>
             </w:r>
@@ -479,12 +309,159 @@
         </w:tc>
       </w:tr>
       <w:tr>
+        <w:trPr>
+          <w:jc w:val="center"/>
+        </w:trPr>
         <w:tc>
           <w:tcPr>
-            <w:tcW w:w="711" w:type="dxa"/>
+            <w:tcW w:w="1184" w:type="dxa"/>
+            <w:tcBorders>
+              <w:top w:val="single" w:sz="4" w:space="0" w:color="auto"/>
+              <w:left w:val="single" w:sz="4" w:space="0" w:color="auto"/>
+              <w:bottom w:val="single" w:sz="4" w:space="0" w:color="auto"/>
+              <w:right w:val="single" w:sz="4" w:space="0" w:color="auto"/>
+            </w:tcBorders>
           </w:tcPr>
           <w:p>
             <w:pPr>
+              <w:spacing w:after="0" w:line="240" w:lineRule="auto"/>
+              <w:jc w:val="center"/>
+              <w:rPr>
+                <w:rFonts w:ascii="Times New Roman" w:hAnsi="Times New Roman" w:cs="Times New Roman"/>
+                <w:lang w:val="en-US"/>
+              </w:rPr>
+            </w:pPr>
+            <w:r>
+              <w:rPr>
+                <w:rFonts w:ascii="Times New Roman" w:hAnsi="Times New Roman" w:cs="Times New Roman"/>
+                <w:lang w:val="en-US"/>
+              </w:rPr>
+              <w:t>{%tr for item in items %}</w:t>
+            </w:r>
+          </w:p>
+        </w:tc>
+        <w:tc>
+          <w:tcPr>
+            <w:tcW w:w="4678" w:type="dxa"/>
+            <w:tcBorders>
+              <w:top w:val="single" w:sz="4" w:space="0" w:color="auto"/>
+              <w:left w:val="single" w:sz="4" w:space="0" w:color="auto"/>
+              <w:bottom w:val="single" w:sz="4" w:space="0" w:color="auto"/>
+              <w:right w:val="single" w:sz="4" w:space="0" w:color="auto"/>
+            </w:tcBorders>
+          </w:tcPr>
+          <w:p>
+            <w:pPr>
+              <w:spacing w:after="0" w:line="240" w:lineRule="auto"/>
+              <w:rPr>
+                <w:rFonts w:ascii="Times New Roman" w:hAnsi="Times New Roman" w:cs="Times New Roman"/>
+                <w:lang w:val="en-US"/>
+              </w:rPr>
+            </w:pPr>
+          </w:p>
+        </w:tc>
+        <w:tc>
+          <w:tcPr>
+            <w:tcW w:w="992" w:type="dxa"/>
+            <w:tcBorders>
+              <w:top w:val="single" w:sz="4" w:space="0" w:color="auto"/>
+              <w:left w:val="single" w:sz="4" w:space="0" w:color="auto"/>
+              <w:bottom w:val="single" w:sz="4" w:space="0" w:color="auto"/>
+              <w:right w:val="single" w:sz="4" w:space="0" w:color="auto"/>
+            </w:tcBorders>
+          </w:tcPr>
+          <w:p>
+            <w:pPr>
+              <w:spacing w:after="0" w:line="240" w:lineRule="auto"/>
+              <w:jc w:val="right"/>
+              <w:rPr>
+                <w:rFonts w:ascii="Times New Roman" w:hAnsi="Times New Roman" w:cs="Times New Roman"/>
+                <w:lang w:val="en-US"/>
+              </w:rPr>
+            </w:pPr>
+          </w:p>
+        </w:tc>
+        <w:tc>
+          <w:tcPr>
+            <w:tcW w:w="709" w:type="dxa"/>
+            <w:tcBorders>
+              <w:top w:val="single" w:sz="4" w:space="0" w:color="auto"/>
+              <w:left w:val="single" w:sz="4" w:space="0" w:color="auto"/>
+              <w:bottom w:val="single" w:sz="4" w:space="0" w:color="auto"/>
+              <w:right w:val="single" w:sz="4" w:space="0" w:color="auto"/>
+            </w:tcBorders>
+          </w:tcPr>
+          <w:p>
+            <w:pPr>
+              <w:spacing w:after="0" w:line="240" w:lineRule="auto"/>
+              <w:jc w:val="right"/>
+              <w:rPr>
+                <w:rFonts w:ascii="Times New Roman" w:hAnsi="Times New Roman" w:cs="Times New Roman"/>
+                <w:lang w:val="en-US"/>
+              </w:rPr>
+            </w:pPr>
+          </w:p>
+        </w:tc>
+        <w:tc>
+          <w:tcPr>
+            <w:tcW w:w="1134" w:type="dxa"/>
+            <w:tcBorders>
+              <w:top w:val="single" w:sz="4" w:space="0" w:color="auto"/>
+              <w:left w:val="single" w:sz="4" w:space="0" w:color="auto"/>
+              <w:bottom w:val="single" w:sz="4" w:space="0" w:color="auto"/>
+              <w:right w:val="single" w:sz="4" w:space="0" w:color="auto"/>
+            </w:tcBorders>
+          </w:tcPr>
+          <w:p>
+            <w:pPr>
+              <w:spacing w:after="0" w:line="240" w:lineRule="auto"/>
+              <w:jc w:val="right"/>
+              <w:rPr>
+                <w:rFonts w:ascii="Times New Roman" w:hAnsi="Times New Roman" w:cs="Times New Roman"/>
+                <w:lang w:val="en-US"/>
+              </w:rPr>
+            </w:pPr>
+          </w:p>
+        </w:tc>
+        <w:tc>
+          <w:tcPr>
+            <w:tcW w:w="1559" w:type="dxa"/>
+            <w:tcBorders>
+              <w:top w:val="single" w:sz="4" w:space="0" w:color="auto"/>
+              <w:left w:val="single" w:sz="4" w:space="0" w:color="auto"/>
+              <w:bottom w:val="single" w:sz="4" w:space="0" w:color="auto"/>
+              <w:right w:val="single" w:sz="4" w:space="0" w:color="auto"/>
+            </w:tcBorders>
+          </w:tcPr>
+          <w:p>
+            <w:pPr>
+              <w:spacing w:after="0" w:line="240" w:lineRule="auto"/>
+              <w:jc w:val="right"/>
+              <w:rPr>
+                <w:rFonts w:ascii="Times New Roman" w:hAnsi="Times New Roman" w:cs="Times New Roman"/>
+                <w:lang w:val="en-US"/>
+              </w:rPr>
+            </w:pPr>
+          </w:p>
+        </w:tc>
+      </w:tr>
+      <w:tr>
+        <w:trPr>
+          <w:jc w:val="center"/>
+        </w:trPr>
+        <w:tc>
+          <w:tcPr>
+            <w:tcW w:w="1184" w:type="dxa"/>
+            <w:tcBorders>
+              <w:top w:val="single" w:sz="4" w:space="0" w:color="auto"/>
+              <w:left w:val="single" w:sz="4" w:space="0" w:color="auto"/>
+              <w:bottom w:val="single" w:sz="4" w:space="0" w:color="auto"/>
+              <w:right w:val="single" w:sz="4" w:space="0" w:color="auto"/>
+            </w:tcBorders>
+          </w:tcPr>
+          <w:p>
+            <w:pPr>
+              <w:spacing w:after="0" w:line="240" w:lineRule="auto"/>
               <w:jc w:val="center"/>
               <w:rPr>
                 <w:rFonts w:ascii="Times New Roman" w:hAnsi="Times New Roman" w:cs="Times New Roman"/>
@@ -494,244 +471,355 @@
               <w:rPr>
                 <w:rFonts w:ascii="Times New Roman" w:hAnsi="Times New Roman" w:cs="Times New Roman"/>
               </w:rPr>
-              <w:t>{% tr for item in items %}</w:t>
+              <w:t>{{ loop.index }}</w:t>
             </w:r>
           </w:p>
         </w:tc>
         <w:tc>
           <w:tcPr>
-            <w:tcW w:w="3508" w:type="dxa"/>
+            <w:tcW w:w="4678" w:type="dxa"/>
+            <w:tcBorders>
+              <w:top w:val="single" w:sz="4" w:space="0" w:color="auto"/>
+              <w:left w:val="single" w:sz="4" w:space="0" w:color="auto"/>
+              <w:bottom w:val="single" w:sz="4" w:space="0" w:color="auto"/>
+              <w:right w:val="single" w:sz="4" w:space="0" w:color="auto"/>
+            </w:tcBorders>
           </w:tcPr>
           <w:p>
             <w:pPr>
+              <w:spacing w:after="0" w:line="240" w:lineRule="auto"/>
               <w:rPr>
                 <w:rFonts w:ascii="Times New Roman" w:hAnsi="Times New Roman" w:cs="Times New Roman"/>
-                <w:lang w:val="ru-RU"/>
               </w:rPr>
             </w:pPr>
-            <w:proofErr w:type="gramStart"/>
             <w:r>
               <w:rPr>
                 <w:rFonts w:ascii="Times New Roman" w:hAnsi="Times New Roman" w:cs="Times New Roman"/>
-                <w:sz w:val="19"/>
               </w:rPr>
-              <w:t>{{ item.name</w:t>
-            </w:r>
-            <w:proofErr w:type="gramEnd"/>
-            <w:r>
-              <w:rPr>
-                <w:rFonts w:ascii="Times New Roman" w:hAnsi="Times New Roman" w:cs="Times New Roman"/>
-                <w:sz w:val="19"/>
-              </w:rPr>
-              <w:t xml:space="preserve"> }}</w:t>
+              <w:t>{{ item.name }}</w:t>
             </w:r>
           </w:p>
         </w:tc>
         <w:tc>
           <w:tcPr>
-            <w:tcW w:w="1144" w:type="dxa"/>
+            <w:tcW w:w="992" w:type="dxa"/>
+            <w:tcBorders>
+              <w:top w:val="single" w:sz="4" w:space="0" w:color="auto"/>
+              <w:left w:val="single" w:sz="4" w:space="0" w:color="auto"/>
+              <w:bottom w:val="single" w:sz="4" w:space="0" w:color="auto"/>
+              <w:right w:val="single" w:sz="4" w:space="0" w:color="auto"/>
+            </w:tcBorders>
           </w:tcPr>
           <w:p>
             <w:pPr>
+              <w:spacing w:after="0" w:line="240" w:lineRule="auto"/>
+              <w:jc w:val="right"/>
+              <w:rPr>
+                <w:rFonts w:ascii="Times New Roman" w:hAnsi="Times New Roman" w:cs="Times New Roman"/>
+              </w:rPr>
+            </w:pPr>
+            <w:r>
+              <w:rPr>
+                <w:rFonts w:ascii="Times New Roman" w:hAnsi="Times New Roman" w:cs="Times New Roman"/>
+              </w:rPr>
+              <w:t>{{ item.quantity }}</w:t>
+            </w:r>
+          </w:p>
+        </w:tc>
+        <w:tc>
+          <w:tcPr>
+            <w:tcW w:w="709" w:type="dxa"/>
+            <w:tcBorders>
+              <w:top w:val="single" w:sz="4" w:space="0" w:color="auto"/>
+              <w:left w:val="single" w:sz="4" w:space="0" w:color="auto"/>
+              <w:bottom w:val="single" w:sz="4" w:space="0" w:color="auto"/>
+              <w:right w:val="single" w:sz="4" w:space="0" w:color="auto"/>
+            </w:tcBorders>
+          </w:tcPr>
+          <w:p>
+            <w:pPr>
+              <w:spacing w:after="0" w:line="240" w:lineRule="auto"/>
+              <w:jc w:val="right"/>
+              <w:rPr>
+                <w:rFonts w:ascii="Times New Roman" w:hAnsi="Times New Roman" w:cs="Times New Roman"/>
+              </w:rPr>
+            </w:pPr>
+            <w:r>
+              <w:rPr>
+                <w:rFonts w:ascii="Times New Roman" w:hAnsi="Times New Roman" w:cs="Times New Roman"/>
+              </w:rPr>
+              <w:t>рейс</w:t>
+            </w:r>
+          </w:p>
+        </w:tc>
+        <w:tc>
+          <w:tcPr>
+            <w:tcW w:w="1134" w:type="dxa"/>
+            <w:tcBorders>
+              <w:top w:val="single" w:sz="4" w:space="0" w:color="auto"/>
+              <w:left w:val="single" w:sz="4" w:space="0" w:color="auto"/>
+              <w:bottom w:val="single" w:sz="4" w:space="0" w:color="auto"/>
+              <w:right w:val="single" w:sz="4" w:space="0" w:color="auto"/>
+            </w:tcBorders>
+          </w:tcPr>
+          <w:p>
+            <w:pPr>
+              <w:spacing w:after="0" w:line="240" w:lineRule="auto"/>
+              <w:jc w:val="right"/>
+              <w:rPr>
+                <w:rFonts w:ascii="Times New Roman" w:hAnsi="Times New Roman" w:cs="Times New Roman"/>
+              </w:rPr>
+            </w:pPr>
+            <w:r>
+              <w:rPr>
+                <w:rFonts w:ascii="Times New Roman" w:hAnsi="Times New Roman" w:cs="Times New Roman"/>
+              </w:rPr>
+              <w:t>{{ item.price }}</w:t>
+            </w:r>
+          </w:p>
+        </w:tc>
+        <w:tc>
+          <w:tcPr>
+            <w:tcW w:w="1559" w:type="dxa"/>
+            <w:tcBorders>
+              <w:top w:val="single" w:sz="4" w:space="0" w:color="auto"/>
+              <w:left w:val="single" w:sz="4" w:space="0" w:color="auto"/>
+              <w:bottom w:val="single" w:sz="4" w:space="0" w:color="auto"/>
+              <w:right w:val="single" w:sz="4" w:space="0" w:color="auto"/>
+            </w:tcBorders>
+          </w:tcPr>
+          <w:p>
+            <w:pPr>
+              <w:spacing w:after="0" w:line="240" w:lineRule="auto"/>
+              <w:jc w:val="right"/>
+              <w:rPr>
+                <w:rFonts w:ascii="Times New Roman" w:hAnsi="Times New Roman" w:cs="Times New Roman"/>
+              </w:rPr>
+            </w:pPr>
+            <w:r>
+              <w:rPr>
+                <w:rFonts w:ascii="Times New Roman" w:hAnsi="Times New Roman" w:cs="Times New Roman"/>
+              </w:rPr>
+              <w:t>{{ item.total }}</w:t>
+            </w:r>
+          </w:p>
+          <w:p>
+            <w:pPr>
+              <w:spacing w:after="0" w:line="240" w:lineRule="auto"/>
+              <w:jc w:val="right"/>
+              <w:rPr>
+                <w:rFonts w:ascii="Times New Roman" w:hAnsi="Times New Roman" w:cs="Times New Roman"/>
+              </w:rPr>
+            </w:pPr>
+          </w:p>
+        </w:tc>
+      </w:tr>
+      <w:tr>
+        <w:trPr>
+          <w:jc w:val="center"/>
+        </w:trPr>
+        <w:tc>
+          <w:tcPr>
+            <w:tcW w:w="1184" w:type="dxa"/>
+            <w:tcBorders>
+              <w:top w:val="single" w:sz="4" w:space="0" w:color="auto"/>
+              <w:left w:val="single" w:sz="4" w:space="0" w:color="auto"/>
+              <w:bottom w:val="single" w:sz="4" w:space="0" w:color="auto"/>
+              <w:right w:val="single" w:sz="4" w:space="0" w:color="auto"/>
+            </w:tcBorders>
+          </w:tcPr>
+          <w:p>
+            <w:pPr>
+              <w:spacing w:after="0" w:line="240" w:lineRule="auto"/>
               <w:jc w:val="center"/>
               <w:rPr>
                 <w:rFonts w:ascii="Times New Roman" w:hAnsi="Times New Roman" w:cs="Times New Roman"/>
               </w:rPr>
             </w:pPr>
-            <w:proofErr w:type="spellStart"/>
             <w:r>
               <w:rPr>
                 <w:rFonts w:ascii="Times New Roman" w:hAnsi="Times New Roman" w:cs="Times New Roman"/>
-                <w:sz w:val="19"/>
               </w:rPr>
-              <w:t>рейс</w:t>
-            </w:r>
-            <w:proofErr w:type="spellEnd"/>
-          </w:p>
-        </w:tc>
-        <w:tc>
-          <w:tcPr>
-            <w:tcW w:w="1224" w:type="dxa"/>
-          </w:tcPr>
-          <w:p>
-            <w:pPr>
-              <w:jc w:val="center"/>
-              <w:rPr>
-                <w:rFonts w:ascii="Times New Roman" w:hAnsi="Times New Roman" w:cs="Times New Roman"/>
-              </w:rPr>
-            </w:pPr>
-            <w:proofErr w:type="gramStart"/>
-            <w:r>
-              <w:rPr>
-                <w:rFonts w:ascii="Times New Roman" w:hAnsi="Times New Roman" w:cs="Times New Roman"/>
-                <w:sz w:val="19"/>
-              </w:rPr>
-              <w:t xml:space="preserve">{{ </w:t>
-            </w:r>
-            <w:proofErr w:type="spellStart"/>
-            <w:r>
-              <w:rPr>
-                <w:rFonts w:ascii="Times New Roman" w:hAnsi="Times New Roman" w:cs="Times New Roman"/>
-                <w:sz w:val="19"/>
-              </w:rPr>
-              <w:t>item</w:t>
-            </w:r>
-            <w:proofErr w:type="gramEnd"/>
-            <w:r>
-              <w:rPr>
-                <w:rFonts w:ascii="Times New Roman" w:hAnsi="Times New Roman" w:cs="Times New Roman"/>
-                <w:sz w:val="19"/>
-              </w:rPr>
-              <w:t>.quantity</w:t>
-            </w:r>
-            <w:proofErr w:type="spellEnd"/>
-            <w:r>
-              <w:rPr>
-                <w:rFonts w:ascii="Times New Roman" w:hAnsi="Times New Roman" w:cs="Times New Roman"/>
-                <w:sz w:val="19"/>
-              </w:rPr>
-              <w:t xml:space="preserve"> }}</w:t>
+              <w:t>{%tr endfor %}</w:t>
             </w:r>
           </w:p>
         </w:tc>
         <w:tc>
           <w:tcPr>
-            <w:tcW w:w="1425" w:type="dxa"/>
+            <w:tcW w:w="4678" w:type="dxa"/>
+            <w:tcBorders>
+              <w:top w:val="single" w:sz="4" w:space="0" w:color="auto"/>
+              <w:left w:val="single" w:sz="4" w:space="0" w:color="auto"/>
+              <w:bottom w:val="single" w:sz="4" w:space="0" w:color="auto"/>
+              <w:right w:val="single" w:sz="4" w:space="0" w:color="auto"/>
+            </w:tcBorders>
           </w:tcPr>
           <w:p>
             <w:pPr>
+              <w:spacing w:after="0" w:line="240" w:lineRule="auto"/>
               <w:rPr>
                 <w:rFonts w:ascii="Times New Roman" w:hAnsi="Times New Roman" w:cs="Times New Roman"/>
               </w:rPr>
             </w:pPr>
-            <w:proofErr w:type="gramStart"/>
-            <w:r>
-              <w:rPr>
-                <w:rFonts w:ascii="Times New Roman" w:hAnsi="Times New Roman" w:cs="Times New Roman"/>
-                <w:sz w:val="19"/>
-              </w:rPr>
-              <w:t xml:space="preserve">{{ </w:t>
-            </w:r>
-            <w:proofErr w:type="spellStart"/>
-            <w:r>
-              <w:rPr>
-                <w:rFonts w:ascii="Times New Roman" w:hAnsi="Times New Roman" w:cs="Times New Roman"/>
-                <w:sz w:val="19"/>
-              </w:rPr>
-              <w:t>item</w:t>
-            </w:r>
-            <w:proofErr w:type="gramEnd"/>
-            <w:r>
-              <w:rPr>
-                <w:rFonts w:ascii="Times New Roman" w:hAnsi="Times New Roman" w:cs="Times New Roman"/>
-                <w:sz w:val="19"/>
-              </w:rPr>
-              <w:t>.price</w:t>
-            </w:r>
-            <w:proofErr w:type="spellEnd"/>
-            <w:r>
-              <w:rPr>
-                <w:rFonts w:ascii="Times New Roman" w:hAnsi="Times New Roman" w:cs="Times New Roman"/>
-                <w:sz w:val="19"/>
-              </w:rPr>
-              <w:t xml:space="preserve"> }}</w:t>
-            </w:r>
           </w:p>
         </w:tc>
         <w:tc>
           <w:tcPr>
-            <w:tcW w:w="1564" w:type="dxa"/>
+            <w:tcW w:w="992" w:type="dxa"/>
+            <w:tcBorders>
+              <w:top w:val="single" w:sz="4" w:space="0" w:color="auto"/>
+              <w:left w:val="single" w:sz="4" w:space="0" w:color="auto"/>
+              <w:bottom w:val="single" w:sz="4" w:space="0" w:color="auto"/>
+              <w:right w:val="single" w:sz="4" w:space="0" w:color="auto"/>
+            </w:tcBorders>
           </w:tcPr>
           <w:p>
             <w:pPr>
+              <w:spacing w:after="0" w:line="240" w:lineRule="auto"/>
               <w:jc w:val="right"/>
               <w:rPr>
                 <w:rFonts w:ascii="Times New Roman" w:hAnsi="Times New Roman" w:cs="Times New Roman"/>
               </w:rPr>
             </w:pPr>
-            <w:proofErr w:type="gramStart"/>
-            <w:r>
+          </w:p>
+        </w:tc>
+        <w:tc>
+          <w:tcPr>
+            <w:tcW w:w="709" w:type="dxa"/>
+            <w:tcBorders>
+              <w:top w:val="single" w:sz="4" w:space="0" w:color="auto"/>
+              <w:left w:val="single" w:sz="4" w:space="0" w:color="auto"/>
+              <w:bottom w:val="single" w:sz="4" w:space="0" w:color="auto"/>
+              <w:right w:val="single" w:sz="4" w:space="0" w:color="auto"/>
+            </w:tcBorders>
+          </w:tcPr>
+          <w:p>
+            <w:pPr>
+              <w:spacing w:after="0" w:line="240" w:lineRule="auto"/>
+              <w:jc w:val="right"/>
               <w:rPr>
                 <w:rFonts w:ascii="Times New Roman" w:hAnsi="Times New Roman" w:cs="Times New Roman"/>
-                <w:sz w:val="19"/>
               </w:rPr>
-              <w:t xml:space="preserve">{{ </w:t>
-            </w:r>
-            <w:proofErr w:type="spellStart"/>
-            <w:r>
+            </w:pPr>
+          </w:p>
+        </w:tc>
+        <w:tc>
+          <w:tcPr>
+            <w:tcW w:w="1134" w:type="dxa"/>
+            <w:tcBorders>
+              <w:top w:val="single" w:sz="4" w:space="0" w:color="auto"/>
+              <w:left w:val="single" w:sz="4" w:space="0" w:color="auto"/>
+              <w:bottom w:val="single" w:sz="4" w:space="0" w:color="auto"/>
+              <w:right w:val="single" w:sz="4" w:space="0" w:color="auto"/>
+            </w:tcBorders>
+          </w:tcPr>
+          <w:p>
+            <w:pPr>
+              <w:spacing w:after="0" w:line="240" w:lineRule="auto"/>
+              <w:jc w:val="right"/>
               <w:rPr>
                 <w:rFonts w:ascii="Times New Roman" w:hAnsi="Times New Roman" w:cs="Times New Roman"/>
-                <w:sz w:val="19"/>
               </w:rPr>
-              <w:t>item</w:t>
-            </w:r>
-            <w:proofErr w:type="gramEnd"/>
-            <w:r>
+            </w:pPr>
+          </w:p>
+        </w:tc>
+        <w:tc>
+          <w:tcPr>
+            <w:tcW w:w="1559" w:type="dxa"/>
+            <w:tcBorders>
+              <w:top w:val="single" w:sz="4" w:space="0" w:color="auto"/>
+              <w:left w:val="single" w:sz="4" w:space="0" w:color="auto"/>
+              <w:bottom w:val="single" w:sz="4" w:space="0" w:color="auto"/>
+              <w:right w:val="single" w:sz="4" w:space="0" w:color="auto"/>
+            </w:tcBorders>
+          </w:tcPr>
+          <w:p>
+            <w:pPr>
+              <w:spacing w:after="0" w:line="240" w:lineRule="auto"/>
+              <w:jc w:val="right"/>
               <w:rPr>
                 <w:rFonts w:ascii="Times New Roman" w:hAnsi="Times New Roman" w:cs="Times New Roman"/>
-                <w:sz w:val="19"/>
               </w:rPr>
-              <w:t>.</w:t>
-            </w:r>
-            <w:proofErr w:type="gramStart"/>
-            <w:r>
-              <w:rPr>
-                <w:rFonts w:ascii="Times New Roman" w:hAnsi="Times New Roman" w:cs="Times New Roman"/>
-                <w:sz w:val="19"/>
-              </w:rPr>
-              <w:t>total</w:t>
-            </w:r>
-            <w:proofErr w:type="spellEnd"/>
-            <w:r>
-              <w:rPr>
-                <w:rFonts w:ascii="Times New Roman" w:hAnsi="Times New Roman" w:cs="Times New Roman"/>
-                <w:sz w:val="19"/>
-              </w:rPr>
-              <w:t xml:space="preserve"> }</w:t>
-            </w:r>
-            <w:proofErr w:type="gramEnd"/>
-            <w:r>
-              <w:rPr>
-                <w:rFonts w:ascii="Times New Roman" w:hAnsi="Times New Roman" w:cs="Times New Roman"/>
-                <w:sz w:val="19"/>
-              </w:rPr>
-              <w:t>}</w:t>
-            </w:r>
-            <w:r>
-              <w:rPr>
-                <w:rFonts w:ascii="Times New Roman" w:hAnsi="Times New Roman" w:cs="Times New Roman"/>
-                <w:sz w:val="19"/>
-                <w:lang w:val="ru-RU"/>
-              </w:rPr>
-              <w:t xml:space="preserve"> </w:t>
-            </w:r>
-            <w:r>
-              <w:rPr>
-                <w:rFonts w:ascii="Times New Roman" w:hAnsi="Times New Roman" w:cs="Times New Roman"/>
-                <w:sz w:val="19"/>
-              </w:rPr>
-              <w:t xml:space="preserve">{% tr </w:t>
-            </w:r>
-            <w:proofErr w:type="spellStart"/>
-            <w:r>
-              <w:rPr>
-                <w:rFonts w:ascii="Times New Roman" w:hAnsi="Times New Roman" w:cs="Times New Roman"/>
-                <w:sz w:val="19"/>
-              </w:rPr>
-              <w:t>endfor</w:t>
-            </w:r>
-            <w:proofErr w:type="spellEnd"/>
-            <w:r>
-              <w:rPr>
-                <w:rFonts w:ascii="Times New Roman" w:hAnsi="Times New Roman" w:cs="Times New Roman"/>
-                <w:sz w:val="19"/>
-              </w:rPr>
-              <w:t xml:space="preserve"> %}</w:t>
-            </w:r>
+            </w:pPr>
           </w:p>
         </w:tc>
       </w:tr>
     </w:tbl>
+    <w:p>
+      <w:pPr>
+        <w:spacing w:after="240"/>
+        <w:rPr>
+          <w:rFonts w:ascii="Times New Roman" w:hAnsi="Times New Roman" w:cs="Times New Roman"/>
+          <w:lang w:val="en-US"/>
+        </w:rPr>
+      </w:pPr>
+    </w:p>
+    <w:p>
+      <w:pPr>
+        <w:jc w:val="right"/>
+        <w:rPr>
+          <w:rFonts w:ascii="Times New Roman" w:hAnsi="Times New Roman" w:cs="Times New Roman"/>
+          <w:lang w:val="en-US"/>
+        </w:rPr>
+      </w:pPr>
+      <w:r>
+        <w:rPr>
+          <w:rFonts w:ascii="Times New Roman" w:hAnsi="Times New Roman" w:cs="Times New Roman"/>
+          <w:b/>
+          <w:sz w:val="20"/>
+        </w:rPr>
+        <w:t>Итого</w:t>
+      </w:r>
+      <w:r>
+        <w:rPr>
+          <w:rFonts w:ascii="Times New Roman" w:hAnsi="Times New Roman" w:cs="Times New Roman"/>
+          <w:b/>
+          <w:sz w:val="20"/>
+          <w:lang w:val="en-US"/>
+        </w:rPr>
+        <w:t xml:space="preserve">: </w:t>
+      </w:r>
+      <w:r>
+        <w:rPr>
+          <w:rFonts w:ascii="Times New Roman" w:hAnsi="Times New Roman" w:cs="Times New Roman"/>
+          <w:b/>
+          <w:sz w:val="20"/>
+          <w:lang w:val="en-US"/>
+        </w:rPr>
+        <w:t>{{ totals.total_amount }}</w:t>
+      </w:r>
+    </w:p>
+    <w:p>
+      <w:pPr>
+        <w:jc w:val="right"/>
+        <w:rPr>
+          <w:rFonts w:ascii="Times New Roman" w:hAnsi="Times New Roman" w:cs="Times New Roman"/>
+        </w:rPr>
+      </w:pPr>
+      <w:r>
+        <w:rPr>
+          <w:rFonts w:ascii="Times New Roman" w:hAnsi="Times New Roman" w:cs="Times New Roman"/>
+          <w:sz w:val="20"/>
+        </w:rPr>
+        <w:t>Без налога (НДС): -</w:t>
+      </w:r>
+    </w:p>
+    <w:p>
+      <w:pPr>
+        <w:jc w:val="right"/>
+        <w:rPr>
+          <w:rFonts w:ascii="Times New Roman" w:hAnsi="Times New Roman" w:cs="Times New Roman"/>
+        </w:rPr>
+      </w:pPr>
+      <w:r>
+        <w:rPr>
+          <w:rFonts w:ascii="Times New Roman" w:hAnsi="Times New Roman" w:cs="Times New Roman"/>
+          <w:b/>
+          <w:sz w:val="20"/>
+        </w:rPr>
+        <w:t>Всего (с учетом НДС): -</w:t>
+      </w:r>
+    </w:p>
     <w:p>
       <w:pPr>
         <w:spacing w:after="240"/>
@@ -742,107 +830,9 @@
     </w:p>
     <w:p>
       <w:pPr>
-        <w:jc w:val="right"/>
+        <w:spacing w:after="240"/>
         <w:rPr>
           <w:rFonts w:ascii="Times New Roman" w:hAnsi="Times New Roman" w:cs="Times New Roman"/>
-        </w:rPr>
-      </w:pPr>
-      <w:proofErr w:type="spellStart"/>
-      <w:r>
-        <w:rPr>
-          <w:rFonts w:ascii="Times New Roman" w:hAnsi="Times New Roman" w:cs="Times New Roman"/>
-          <w:b/>
-          <w:sz w:val="20"/>
-        </w:rPr>
-        <w:t>Итого</w:t>
-      </w:r>
-      <w:proofErr w:type="spellEnd"/>
-      <w:r>
-        <w:rPr>
-          <w:rFonts w:ascii="Times New Roman" w:hAnsi="Times New Roman" w:cs="Times New Roman"/>
-          <w:b/>
-          <w:sz w:val="20"/>
-        </w:rPr>
-        <w:t xml:space="preserve">: </w:t>
-      </w:r>
-      <w:proofErr w:type="gramStart"/>
-      <w:r>
-        <w:rPr>
-          <w:rFonts w:ascii="Times New Roman" w:hAnsi="Times New Roman" w:cs="Times New Roman"/>
-          <w:b/>
-          <w:sz w:val="20"/>
-        </w:rPr>
-        <w:t xml:space="preserve">{{ </w:t>
-      </w:r>
-      <w:proofErr w:type="spellStart"/>
-      <w:r>
-        <w:rPr>
-          <w:rFonts w:ascii="Times New Roman" w:hAnsi="Times New Roman" w:cs="Times New Roman"/>
-          <w:b/>
-          <w:sz w:val="20"/>
-        </w:rPr>
-        <w:t>totals</w:t>
-      </w:r>
-      <w:proofErr w:type="gramEnd"/>
-      <w:r>
-        <w:rPr>
-          <w:rFonts w:ascii="Times New Roman" w:hAnsi="Times New Roman" w:cs="Times New Roman"/>
-          <w:b/>
-          <w:sz w:val="20"/>
-        </w:rPr>
-        <w:t>.total_</w:t>
-      </w:r>
-      <w:proofErr w:type="gramStart"/>
-      <w:r>
-        <w:rPr>
-          <w:rFonts w:ascii="Times New Roman" w:hAnsi="Times New Roman" w:cs="Times New Roman"/>
-          <w:b/>
-          <w:sz w:val="20"/>
-        </w:rPr>
-        <w:t>amount</w:t>
-      </w:r>
-      <w:proofErr w:type="spellEnd"/>
-      <w:r>
-        <w:rPr>
-          <w:rFonts w:ascii="Times New Roman" w:hAnsi="Times New Roman" w:cs="Times New Roman"/>
-          <w:b/>
-          <w:sz w:val="20"/>
-        </w:rPr>
-        <w:t xml:space="preserve"> }</w:t>
-      </w:r>
-      <w:proofErr w:type="gramEnd"/>
-      <w:r>
-        <w:rPr>
-          <w:rFonts w:ascii="Times New Roman" w:hAnsi="Times New Roman" w:cs="Times New Roman"/>
-          <w:b/>
-          <w:sz w:val="20"/>
-        </w:rPr>
-        <w:t>}</w:t>
-      </w:r>
-    </w:p>
-    <w:p>
-      <w:pPr>
-        <w:jc w:val="right"/>
-        <w:rPr>
-          <w:rFonts w:ascii="Times New Roman" w:hAnsi="Times New Roman" w:cs="Times New Roman"/>
-          <w:lang w:val="ru-RU"/>
-        </w:rPr>
-      </w:pPr>
-      <w:r>
-        <w:rPr>
-          <w:rFonts w:ascii="Times New Roman" w:hAnsi="Times New Roman" w:cs="Times New Roman"/>
-          <w:sz w:val="20"/>
-          <w:lang w:val="ru-RU"/>
-        </w:rPr>
-        <w:t>Без налога (НДС): -</w:t>
-      </w:r>
-    </w:p>
-    <w:p>
-      <w:pPr>
-        <w:jc w:val="right"/>
-        <w:rPr>
-          <w:rFonts w:ascii="Times New Roman" w:hAnsi="Times New Roman" w:cs="Times New Roman"/>
-          <w:lang w:val="ru-RU"/>
         </w:rPr>
       </w:pPr>
       <w:r>
@@ -850,86 +840,15 @@
           <w:rFonts w:ascii="Times New Roman" w:hAnsi="Times New Roman" w:cs="Times New Roman"/>
           <w:b/>
           <w:sz w:val="20"/>
-          <w:lang w:val="ru-RU"/>
-        </w:rPr>
-        <w:t>Всего (с учетом НДС): -</w:t>
-      </w:r>
-    </w:p>
-    <w:p>
-      <w:pPr>
-        <w:spacing w:after="240"/>
-        <w:rPr>
-          <w:rFonts w:ascii="Times New Roman" w:hAnsi="Times New Roman" w:cs="Times New Roman"/>
-          <w:lang w:val="ru-RU"/>
-        </w:rPr>
-      </w:pPr>
-    </w:p>
-    <w:p>
-      <w:pPr>
-        <w:spacing w:after="240"/>
-        <w:rPr>
-          <w:rFonts w:ascii="Times New Roman" w:hAnsi="Times New Roman" w:cs="Times New Roman"/>
-          <w:lang w:val="ru-RU"/>
-        </w:rPr>
-      </w:pPr>
-      <w:r>
-        <w:rPr>
-          <w:rFonts w:ascii="Times New Roman" w:hAnsi="Times New Roman" w:cs="Times New Roman"/>
-          <w:b/>
-          <w:sz w:val="20"/>
-          <w:lang w:val="ru-RU"/>
         </w:rPr>
         <w:t xml:space="preserve">Всего выполнено работ (оказано услуг) на сумму: </w:t>
-      </w:r>
-      <w:proofErr w:type="gramStart"/>
-      <w:r>
-        <w:rPr>
-          <w:rFonts w:ascii="Times New Roman" w:hAnsi="Times New Roman" w:cs="Times New Roman"/>
-          <w:sz w:val="20"/>
-          <w:lang w:val="ru-RU"/>
-        </w:rPr>
-        <w:t xml:space="preserve">{{ </w:t>
       </w:r>
       <w:r>
         <w:rPr>
           <w:rFonts w:ascii="Times New Roman" w:hAnsi="Times New Roman" w:cs="Times New Roman"/>
           <w:sz w:val="20"/>
         </w:rPr>
-        <w:t>total</w:t>
-      </w:r>
-      <w:proofErr w:type="gramEnd"/>
-      <w:r>
-        <w:rPr>
-          <w:rFonts w:ascii="Times New Roman" w:hAnsi="Times New Roman" w:cs="Times New Roman"/>
-          <w:sz w:val="20"/>
-          <w:lang w:val="ru-RU"/>
-        </w:rPr>
-        <w:t>_</w:t>
-      </w:r>
-      <w:proofErr w:type="gramStart"/>
-      <w:r>
-        <w:rPr>
-          <w:rFonts w:ascii="Times New Roman" w:hAnsi="Times New Roman" w:cs="Times New Roman"/>
-          <w:sz w:val="20"/>
-        </w:rPr>
-        <w:t>words</w:t>
-      </w:r>
-      <w:r>
-        <w:rPr>
-          <w:rFonts w:ascii="Times New Roman" w:hAnsi="Times New Roman" w:cs="Times New Roman"/>
-          <w:sz w:val="20"/>
-          <w:lang w:val="ru-RU"/>
-        </w:rPr>
-        <w:t xml:space="preserve"> }</w:t>
-      </w:r>
-      <w:proofErr w:type="gramEnd"/>
-      <w:r>
-        <w:rPr>
-          <w:rFonts w:ascii="Times New Roman" w:hAnsi="Times New Roman" w:cs="Times New Roman"/>
-          <w:sz w:val="20"/>
-          <w:lang w:val="ru-RU"/>
-        </w:rPr>
-        <w:t>}</w:t>
+        <w:t>{{ total_words }}</w:t>
       </w:r>
     </w:p>
     <w:p>
@@ -937,14 +856,12 @@
         <w:spacing w:after="720"/>
         <w:rPr>
           <w:rFonts w:ascii="Times New Roman" w:hAnsi="Times New Roman" w:cs="Times New Roman"/>
-          <w:lang w:val="ru-RU"/>
         </w:rPr>
       </w:pPr>
       <w:r>
         <w:rPr>
           <w:rFonts w:ascii="Times New Roman" w:hAnsi="Times New Roman" w:cs="Times New Roman"/>
           <w:sz w:val="20"/>
-          <w:lang w:val="ru-RU"/>
         </w:rPr>
         <w:t>Вышеперечисленные работы (услуги) выполнены полностью и в срок. Заказчик претензий по объему, качеству и срокам выполнения работ (оказания услуг) не имеет.</w:t>
       </w:r>
@@ -1014,14 +931,12 @@
             <w:pPr>
               <w:rPr>
                 <w:rFonts w:ascii="Times New Roman" w:hAnsi="Times New Roman" w:cs="Times New Roman"/>
-                <w:lang w:val="ru-RU"/>
               </w:rPr>
             </w:pPr>
             <w:r>
               <w:rPr>
                 <w:rFonts w:ascii="Times New Roman" w:hAnsi="Times New Roman" w:cs="Times New Roman"/>
                 <w:sz w:val="19"/>
-                <w:lang w:val="ru-RU"/>
               </w:rPr>
               <w:br/>
               <w:t>_______________</w:t>
@@ -1030,7 +945,6 @@
               <w:rPr>
                 <w:rFonts w:ascii="Times New Roman" w:hAnsi="Times New Roman" w:cs="Times New Roman"/>
                 <w:sz w:val="19"/>
-                <w:lang w:val="ru-RU"/>
               </w:rPr>
               <w:t xml:space="preserve"> </w:t>
             </w:r>
@@ -1038,90 +952,27 @@
               <w:rPr>
                 <w:rFonts w:ascii="Times New Roman" w:hAnsi="Times New Roman" w:cs="Times New Roman"/>
                 <w:sz w:val="19"/>
-                <w:lang w:val="ru-RU"/>
               </w:rPr>
               <w:t>(</w:t>
-            </w:r>
-            <w:proofErr w:type="gramStart"/>
-            <w:r>
-              <w:rPr>
-                <w:rFonts w:ascii="Times New Roman" w:hAnsi="Times New Roman" w:cs="Times New Roman"/>
-                <w:sz w:val="19"/>
-                <w:lang w:val="ru-RU"/>
-              </w:rPr>
-              <w:t xml:space="preserve">_{{ </w:t>
             </w:r>
             <w:r>
               <w:rPr>
                 <w:rFonts w:ascii="Times New Roman" w:hAnsi="Times New Roman" w:cs="Times New Roman"/>
                 <w:sz w:val="19"/>
               </w:rPr>
-              <w:t>company</w:t>
+              <w:t>_{{ company.ceo_name }}</w:t>
             </w:r>
             <w:r>
               <w:rPr>
                 <w:rFonts w:ascii="Times New Roman" w:hAnsi="Times New Roman" w:cs="Times New Roman"/>
                 <w:sz w:val="19"/>
-                <w:lang w:val="ru-RU"/>
               </w:rPr>
-              <w:t>.</w:t>
-            </w:r>
-            <w:proofErr w:type="spellStart"/>
-            <w:r>
-              <w:rPr>
-                <w:rFonts w:ascii="Times New Roman" w:hAnsi="Times New Roman" w:cs="Times New Roman"/>
-                <w:sz w:val="19"/>
-              </w:rPr>
-              <w:t>ceo</w:t>
-            </w:r>
-            <w:proofErr w:type="spellEnd"/>
-            <w:proofErr w:type="gramEnd"/>
-            <w:r>
-              <w:rPr>
-                <w:rFonts w:ascii="Times New Roman" w:hAnsi="Times New Roman" w:cs="Times New Roman"/>
-                <w:sz w:val="19"/>
-                <w:lang w:val="ru-RU"/>
-              </w:rPr>
-              <w:t>_</w:t>
-            </w:r>
-            <w:proofErr w:type="gramStart"/>
-            <w:r>
-              <w:rPr>
-                <w:rFonts w:ascii="Times New Roman" w:hAnsi="Times New Roman" w:cs="Times New Roman"/>
-                <w:sz w:val="19"/>
-              </w:rPr>
-              <w:t>name</w:t>
+              <w:t>_)</w:t>
             </w:r>
             <w:r>
               <w:rPr>
                 <w:rFonts w:ascii="Times New Roman" w:hAnsi="Times New Roman" w:cs="Times New Roman"/>
                 <w:sz w:val="19"/>
-                <w:lang w:val="ru-RU"/>
-              </w:rPr>
-              <w:t xml:space="preserve"> }}</w:t>
-            </w:r>
-            <w:r>
-              <w:rPr>
-                <w:rFonts w:ascii="Times New Roman" w:hAnsi="Times New Roman" w:cs="Times New Roman"/>
-                <w:sz w:val="19"/>
-                <w:lang w:val="ru-RU"/>
-              </w:rPr>
-              <w:t>_</w:t>
-            </w:r>
-            <w:proofErr w:type="gramEnd"/>
-            <w:r>
-              <w:rPr>
-                <w:rFonts w:ascii="Times New Roman" w:hAnsi="Times New Roman" w:cs="Times New Roman"/>
-                <w:sz w:val="19"/>
-                <w:lang w:val="ru-RU"/>
-              </w:rPr>
-              <w:t>)</w:t>
-            </w:r>
-            <w:r>
-              <w:rPr>
-                <w:rFonts w:ascii="Times New Roman" w:hAnsi="Times New Roman" w:cs="Times New Roman"/>
-                <w:sz w:val="19"/>
-                <w:lang w:val="ru-RU"/>
               </w:rPr>
               <w:br/>
               <w:t xml:space="preserve">      подпись            </w:t>
@@ -1130,7 +981,6 @@
               <w:rPr>
                 <w:rFonts w:ascii="Times New Roman" w:hAnsi="Times New Roman" w:cs="Times New Roman"/>
                 <w:sz w:val="19"/>
-                <w:lang w:val="ru-RU"/>
               </w:rPr>
               <w:t xml:space="preserve">        </w:t>
             </w:r>
@@ -1138,7 +988,6 @@
               <w:rPr>
                 <w:rFonts w:ascii="Times New Roman" w:hAnsi="Times New Roman" w:cs="Times New Roman"/>
                 <w:sz w:val="19"/>
-                <w:lang w:val="ru-RU"/>
               </w:rPr>
               <w:t xml:space="preserve"> расшифровка подписи</w:t>
             </w:r>
@@ -1158,15 +1007,8 @@
               <w:rPr>
                 <w:rFonts w:ascii="Times New Roman" w:hAnsi="Times New Roman" w:cs="Times New Roman"/>
                 <w:sz w:val="19"/>
-                <w:lang w:val="ru-RU"/>
               </w:rPr>
               <w:br/>
-            </w:r>
-            <w:r>
-              <w:rPr>
-                <w:rFonts w:ascii="Times New Roman" w:hAnsi="Times New Roman" w:cs="Times New Roman"/>
-                <w:sz w:val="19"/>
-              </w:rPr>
               <w:t>____________________ (____________________)</w:t>
             </w:r>
             <w:r>
@@ -1175,57 +1017,22 @@
                 <w:sz w:val="19"/>
               </w:rPr>
               <w:br/>
-              <w:t xml:space="preserve">      </w:t>
+              <w:t xml:space="preserve">      подпись             </w:t>
             </w:r>
-            <w:proofErr w:type="spellStart"/>
             <w:r>
               <w:rPr>
                 <w:rFonts w:ascii="Times New Roman" w:hAnsi="Times New Roman" w:cs="Times New Roman"/>
                 <w:sz w:val="19"/>
               </w:rPr>
-              <w:t>подпись</w:t>
+              <w:t xml:space="preserve">          </w:t>
             </w:r>
-            <w:proofErr w:type="spellEnd"/>
             <w:r>
               <w:rPr>
                 <w:rFonts w:ascii="Times New Roman" w:hAnsi="Times New Roman" w:cs="Times New Roman"/>
                 <w:sz w:val="19"/>
               </w:rPr>
-              <w:t xml:space="preserve">             </w:t>
+              <w:t>расшифровка подписи</w:t>
             </w:r>
-            <w:r>
-              <w:rPr>
-                <w:rFonts w:ascii="Times New Roman" w:hAnsi="Times New Roman" w:cs="Times New Roman"/>
-                <w:sz w:val="19"/>
-                <w:lang w:val="ru-RU"/>
-              </w:rPr>
-              <w:t xml:space="preserve">          </w:t>
-            </w:r>
-            <w:proofErr w:type="spellStart"/>
-            <w:r>
-              <w:rPr>
-                <w:rFonts w:ascii="Times New Roman" w:hAnsi="Times New Roman" w:cs="Times New Roman"/>
-                <w:sz w:val="19"/>
-              </w:rPr>
-              <w:t>расшифровка</w:t>
-            </w:r>
-            <w:proofErr w:type="spellEnd"/>
-            <w:r>
-              <w:rPr>
-                <w:rFonts w:ascii="Times New Roman" w:hAnsi="Times New Roman" w:cs="Times New Roman"/>
-                <w:sz w:val="19"/>
-              </w:rPr>
-              <w:t xml:space="preserve"> </w:t>
-            </w:r>
-            <w:proofErr w:type="spellStart"/>
-            <w:r>
-              <w:rPr>
-                <w:rFonts w:ascii="Times New Roman" w:hAnsi="Times New Roman" w:cs="Times New Roman"/>
-                <w:sz w:val="19"/>
-              </w:rPr>
-              <w:t>подписи</w:t>
-            </w:r>
-            <w:proofErr w:type="spellEnd"/>
           </w:p>
         </w:tc>
       </w:tr>
@@ -1840,6 +1647,10 @@
     <w:name w:val="Normal"/>
     <w:qFormat/>
     <w:rsid w:val="00FC693F"/>
+    <w:rPr>
+      <w:noProof/>
+      <w:lang w:val="ru-RU"/>
+    </w:rPr>
   </w:style>
   <w:style w:type="paragraph" w:styleId="1">
     <w:name w:val="heading 1"/>
@@ -2053,6 +1864,7 @@
   <w:style w:type="character" w:default="1" w:styleId="a2">
     <w:name w:val="Default Paragraph Font"/>
     <w:uiPriority w:val="1"/>
+    <w:semiHidden/>
     <w:unhideWhenUsed/>
   </w:style>
   <w:style w:type="table" w:default="1" w:styleId="a3">

</xml_diff>